<commit_message>
Update answer-key.docx and track candidates who used v1 (broken) data
- answer-key.docx: replaced 5 references to the impossible BX-009
  TACoS 86% (£1,590÷£1,850) with corrected 43.0% (£1,590÷£3,700)
- Added DATA_FIX_CUTOFF constant (2026-05-11T13:00:00Z)
- Recruiter portal shows a yellow "V1 DATA" badge on candidates whose
  startedAt is before the cutoff
- AI analyze route detects v1 candidates and adds a per-candidate note
  to the prompt instructing Claude:
  · Credit candidates who flagged the data integrity issues
  · Accept their recalculated numbers from Ad Campaign Report
  · Don't penalise them for "missing" the impossible 86% TACoS

Co-Authored-By: Claude Opus 4.6 (1M context) <noreply@anthropic.com>
</commit_message>
<xml_diff>
--- a/public/assets/answer-key.docx
+++ b/public/assets/answer-key.docx
@@ -1156,7 +1156,7 @@
                 <w:sz w:val="16"/>
                 <w:szCs w:val="16"/>
               </w:rPr>
-              <w:t xml:space="preserve">BX-009 total ad spend across 4 campaigns = £1,590 vs revenue £1,850 → TACoS 86.0%. No other SKU exceeds 22% TACoS.</w:t>
+              <w:t xml:space="preserve">BX-009 total ad spend across 4 campaigns = £1,590 vs revenue £3,700 → TACoS 43.0%. More than 2x the next-highest SKU (BX-003 at 20.7%).</w:t>
             </w:r>
           </w:p>
         </w:tc>
@@ -1192,7 +1192,7 @@
                 <w:sz w:val="16"/>
                 <w:szCs w:val="16"/>
               </w:rPr>
-              <w:t xml:space="preserve">Ad Campaign Report: sum CPG-009-01 to 04 Spend. Dashboard: BX-009 revenue £1,850.</w:t>
+              <w:t xml:space="preserve">Ad Campaign Report: sum CPG-009-01 to 04 Spend. Dashboard: BX-009 revenue £3,700.</w:t>
             </w:r>
           </w:p>
         </w:tc>
@@ -9588,7 +9588,7 @@
           <w:sz w:val="17"/>
           <w:szCs w:val="17"/>
         </w:rPr>
-        <w:t xml:space="preserve">BX-009 has 4 campaigns spending £1,590 combined against £1,850 total revenue (TACoS 86%). Every campaign exceeds 48% ACoS. Candidates must diagnose this as a conversion rate problem rather than a bidding problem. A candidate who recommends bid changes without identifying the CVR issue should not exceed 6/15 for this section.</w:t>
+        <w:t xml:space="preserve">BX-009 has 4 campaigns spending £1,590 combined against £3,700 total revenue (TACoS 43%). Every campaign exceeds 48% ACoS. Candidates must diagnose this as a conversion rate problem rather than a bidding problem. A candidate who recommends bid changes without identifying the CVR issue should not exceed 6/15 for this section.</w:t>
       </w:r>
     </w:p>
     <w:p>
@@ -10064,7 +10064,7 @@
                 <w:sz w:val="16"/>
                 <w:szCs w:val="16"/>
               </w:rPr>
-              <w:t xml:space="preserve">£1,590 ÷ £1,850 (Dashboard revenue) = 86.0%</w:t>
+              <w:t xml:space="preserve">£1,590 ÷ £3,700 (Dashboard revenue) = 43.0%</w:t>
             </w:r>
           </w:p>
         </w:tc>
@@ -10580,7 +10580,7 @@
                 <w:sz w:val="16"/>
                 <w:szCs w:val="16"/>
               </w:rPr>
-              <w:t xml:space="preserve">Calculates blended ACoS 54.5% (£1,590 ÷ £2,920) and TACoS 86.0% (£1,590 ÷ £1,850)</w:t>
+              <w:t xml:space="preserve">Calculates blended ACoS 54.5% (£1,590 ÷ £2,920) and TACoS 43.0% (£1,590 ÷ £3,700)</w:t>
             </w:r>
           </w:p>
         </w:tc>

</xml_diff>